<commit_message>
tamarin_proba_3as: double-entry tables read right to left
Co-Authored-By: Claude Opus 5.5 <noreply@anthropic.com>
Claude-Session: https://claude.ai/code/session_015WVgZKTbSWpZTjn6aZsqC9
</commit_message>
<xml_diff>
--- a/documents/probabilites/tamarin_proba_3as.docx
+++ b/documents/probabilites/tamarin_proba_3as.docx
@@ -17286,8 +17286,8 @@
             </w:tblPr>
             <w:tblGrid>
               <w:gridCol w:w="1915"/>
+              <w:gridCol w:w="870"/>
               <w:gridCol w:w="965"/>
-              <w:gridCol w:w="870"/>
               <w:gridCol w:w="1915"/>
             </w:tblGrid>
             <w:tr>
@@ -17309,26 +17309,8 @@
                     <w:rPr>
                       <w:rtl/>
                     </w:rPr>
-                    <w:t xml:space="preserve"/>
+                    <w:t xml:space="preserve">المجموع</w:t>
                   </w:r>
-                </w:p>
-              </w:tc>
-              <w:tc>
-                <w:tcPr>
-                  <w:tcW w:w="965" w:type="dxa"/>
-                  <w:shd w:val="clear" w:color="auto" w:fill="E4E7ED"/>
-                </w:tcPr>
-                <w:p>
-                  <w:pPr>
-                    <w:pStyle w:val="Compact"/>
-                    <w:bidi/>
-                    <w:jc w:val="center"/>
-                  </w:pPr>
-                  <m:oMath>
-                    <m:r>
-                      <m:t>S</m:t>
-                    </m:r>
-                  </m:oMath>
                 </w:p>
               </w:tc>
               <w:tc>
@@ -17358,6 +17340,24 @@
               </w:tc>
               <w:tc>
                 <w:tcPr>
+                  <w:tcW w:w="965" w:type="dxa"/>
+                  <w:shd w:val="clear" w:color="auto" w:fill="E4E7ED"/>
+                </w:tcPr>
+                <w:p>
+                  <w:pPr>
+                    <w:pStyle w:val="Compact"/>
+                    <w:bidi/>
+                    <w:jc w:val="center"/>
+                  </w:pPr>
+                  <m:oMath>
+                    <m:r>
+                      <m:t>S</m:t>
+                    </m:r>
+                  </m:oMath>
+                </w:p>
+              </w:tc>
+              <w:tc>
+                <w:tcPr>
                   <w:tcW w:w="1915" w:type="dxa"/>
                   <w:shd w:val="clear" w:color="auto" w:fill="E4E7ED"/>
                 </w:tcPr>
@@ -17367,12 +17367,6 @@
                     <w:bidi/>
                     <w:jc w:val="center"/>
                   </w:pPr>
-                  <w:r>
-                    <w:rPr>
-                      <w:rtl/>
-                    </w:rPr>
-                    <w:t xml:space="preserve">المجموع</w:t>
-                  </w:r>
                 </w:p>
               </w:tc>
             </w:tr>
@@ -17389,7 +17383,27 @@
                   </w:pPr>
                   <m:oMath>
                     <m:r>
-                      <m:t>F</m:t>
+                      <m:t>120</m:t>
+                    </m:r>
+                  </m:oMath>
+                </w:p>
+              </w:tc>
+              <w:tc>
+                <w:tcPr>
+                  <w:tcW w:w="870" w:type="dxa"/>
+                </w:tcPr>
+                <w:p>
+                  <w:pPr>
+                    <w:pStyle w:val="Compact"/>
+                    <w:bidi/>
+                    <w:jc w:val="center"/>
+                  </w:pPr>
+                  <m:oMath>
+                    <m:r>
+                      <m:rPr>
+                        <m:sty m:val="p"/>
+                      </m:rPr>
+                      <m:t>…</m:t>
                     </m:r>
                   </m:oMath>
                 </w:p>
@@ -17413,7 +17427,7 @@
               </w:tc>
               <w:tc>
                 <w:tcPr>
-                  <w:tcW w:w="870" w:type="dxa"/>
+                  <w:tcW w:w="1915" w:type="dxa"/>
                 </w:tcPr>
                 <w:p>
                   <w:pPr>
@@ -17423,14 +17437,13 @@
                   </w:pPr>
                   <m:oMath>
                     <m:r>
-                      <m:rPr>
-                        <m:sty m:val="p"/>
-                      </m:rPr>
-                      <m:t>…</m:t>
+                      <m:t>F</m:t>
                     </m:r>
                   </m:oMath>
                 </w:p>
               </w:tc>
+            </w:tr>
+            <w:tr>
               <w:tc>
                 <w:tcPr>
                   <w:tcW w:w="1915" w:type="dxa"/>
@@ -17443,13 +17456,51 @@
                   </w:pPr>
                   <m:oMath>
                     <m:r>
-                      <m:t>120</m:t>
+                      <m:rPr>
+                        <m:sty m:val="p"/>
+                      </m:rPr>
+                      <m:t>…</m:t>
                     </m:r>
                   </m:oMath>
                 </w:p>
               </w:tc>
-            </w:tr>
-            <w:tr>
+              <w:tc>
+                <w:tcPr>
+                  <w:tcW w:w="870" w:type="dxa"/>
+                </w:tcPr>
+                <w:p>
+                  <w:pPr>
+                    <w:pStyle w:val="Compact"/>
+                    <w:bidi/>
+                    <w:jc w:val="center"/>
+                  </w:pPr>
+                  <m:oMath>
+                    <m:r>
+                      <m:rPr>
+                        <m:sty m:val="p"/>
+                      </m:rPr>
+                      <m:t>…</m:t>
+                    </m:r>
+                  </m:oMath>
+                </w:p>
+              </w:tc>
+              <w:tc>
+                <w:tcPr>
+                  <w:tcW w:w="965" w:type="dxa"/>
+                </w:tcPr>
+                <w:p>
+                  <w:pPr>
+                    <w:pStyle w:val="Compact"/>
+                    <w:bidi/>
+                    <w:jc w:val="center"/>
+                  </w:pPr>
+                  <m:oMath>
+                    <m:r>
+                      <m:t>50</m:t>
+                    </m:r>
+                  </m:oMath>
+                </w:p>
+              </w:tc>
               <w:tc>
                 <w:tcPr>
                   <w:tcW w:w="1915" w:type="dxa"/>
@@ -17474,9 +17525,11 @@
                   </m:oMath>
                 </w:p>
               </w:tc>
+            </w:tr>
+            <w:tr>
               <w:tc>
                 <w:tcPr>
-                  <w:tcW w:w="965" w:type="dxa"/>
+                  <w:tcW w:w="1915" w:type="dxa"/>
                 </w:tcPr>
                 <w:p>
                   <w:pPr>
@@ -17486,7 +17539,7 @@
                   </w:pPr>
                   <m:oMath>
                     <m:r>
-                      <m:t>50</m:t>
+                      <m:t>200</m:t>
                     </m:r>
                   </m:oMath>
                 </w:p>
@@ -17513,7 +17566,7 @@
               </w:tc>
               <w:tc>
                 <w:tcPr>
-                  <w:tcW w:w="1915" w:type="dxa"/>
+                  <w:tcW w:w="965" w:type="dxa"/>
                 </w:tcPr>
                 <w:p>
                   <w:pPr>
@@ -17531,8 +17584,6 @@
                   </m:oMath>
                 </w:p>
               </w:tc>
-            </w:tr>
-            <w:tr>
               <w:tc>
                 <w:tcPr>
                   <w:tcW w:w="1915" w:type="dxa"/>
@@ -17549,63 +17600,6 @@
                     </w:rPr>
                     <w:t xml:space="preserve">المجموع</w:t>
                   </w:r>
-                </w:p>
-              </w:tc>
-              <w:tc>
-                <w:tcPr>
-                  <w:tcW w:w="965" w:type="dxa"/>
-                </w:tcPr>
-                <w:p>
-                  <w:pPr>
-                    <w:pStyle w:val="Compact"/>
-                    <w:bidi/>
-                    <w:jc w:val="center"/>
-                  </w:pPr>
-                  <m:oMath>
-                    <m:r>
-                      <m:rPr>
-                        <m:sty m:val="p"/>
-                      </m:rPr>
-                      <m:t>…</m:t>
-                    </m:r>
-                  </m:oMath>
-                </w:p>
-              </w:tc>
-              <w:tc>
-                <w:tcPr>
-                  <w:tcW w:w="870" w:type="dxa"/>
-                </w:tcPr>
-                <w:p>
-                  <w:pPr>
-                    <w:pStyle w:val="Compact"/>
-                    <w:bidi/>
-                    <w:jc w:val="center"/>
-                  </w:pPr>
-                  <m:oMath>
-                    <m:r>
-                      <m:rPr>
-                        <m:sty m:val="p"/>
-                      </m:rPr>
-                      <m:t>…</m:t>
-                    </m:r>
-                  </m:oMath>
-                </w:p>
-              </w:tc>
-              <w:tc>
-                <w:tcPr>
-                  <w:tcW w:w="1915" w:type="dxa"/>
-                </w:tcPr>
-                <w:p>
-                  <w:pPr>
-                    <w:pStyle w:val="Compact"/>
-                    <w:bidi/>
-                    <w:jc w:val="center"/>
-                  </w:pPr>
-                  <m:oMath>
-                    <m:r>
-                      <m:t>200</m:t>
-                    </m:r>
-                  </m:oMath>
                 </w:p>
               </w:tc>
             </w:tr>
@@ -18079,8 +18073,8 @@
             </w:tblPr>
             <w:tblGrid>
               <w:gridCol w:w="1915"/>
+              <w:gridCol w:w="965"/>
               <w:gridCol w:w="1155"/>
-              <w:gridCol w:w="965"/>
               <w:gridCol w:w="1915"/>
             </w:tblGrid>
             <w:tr>
@@ -18102,26 +18096,8 @@
                     <w:rPr>
                       <w:rtl/>
                     </w:rPr>
-                    <w:t xml:space="preserve"/>
+                    <w:t xml:space="preserve">المجموع</w:t>
                   </w:r>
-                </w:p>
-              </w:tc>
-              <w:tc>
-                <w:tcPr>
-                  <w:tcW w:w="1155" w:type="dxa"/>
-                  <w:shd w:val="clear" w:color="auto" w:fill="E4E7ED"/>
-                </w:tcPr>
-                <w:p>
-                  <w:pPr>
-                    <w:pStyle w:val="Compact"/>
-                    <w:bidi/>
-                    <w:jc w:val="center"/>
-                  </w:pPr>
-                  <m:oMath>
-                    <m:r>
-                      <m:t>S</m:t>
-                    </m:r>
-                  </m:oMath>
                 </w:p>
               </w:tc>
               <w:tc>
@@ -18151,6 +18127,24 @@
               </w:tc>
               <w:tc>
                 <w:tcPr>
+                  <w:tcW w:w="1155" w:type="dxa"/>
+                  <w:shd w:val="clear" w:color="auto" w:fill="E4E7ED"/>
+                </w:tcPr>
+                <w:p>
+                  <w:pPr>
+                    <w:pStyle w:val="Compact"/>
+                    <w:bidi/>
+                    <w:jc w:val="center"/>
+                  </w:pPr>
+                  <m:oMath>
+                    <m:r>
+                      <m:t>S</m:t>
+                    </m:r>
+                  </m:oMath>
+                </w:p>
+              </w:tc>
+              <w:tc>
+                <w:tcPr>
                   <w:tcW w:w="1915" w:type="dxa"/>
                   <w:shd w:val="clear" w:color="auto" w:fill="E4E7ED"/>
                 </w:tcPr>
@@ -18160,12 +18154,6 @@
                     <w:bidi/>
                     <w:jc w:val="center"/>
                   </w:pPr>
-                  <w:r>
-                    <w:rPr>
-                      <w:rtl/>
-                    </w:rPr>
-                    <w:t xml:space="preserve">المجموع</w:t>
-                  </w:r>
                 </w:p>
               </w:tc>
             </w:tr>
@@ -18182,7 +18170,24 @@
                   </w:pPr>
                   <m:oMath>
                     <m:r>
-                      <m:t>F</m:t>
+                      <m:t>120</m:t>
+                    </m:r>
+                  </m:oMath>
+                </w:p>
+              </w:tc>
+              <w:tc>
+                <w:tcPr>
+                  <w:tcW w:w="965" w:type="dxa"/>
+                </w:tcPr>
+                <w:p>
+                  <w:pPr>
+                    <w:pStyle w:val="Compact"/>
+                    <w:bidi/>
+                    <w:jc w:val="center"/>
+                  </w:pPr>
+                  <m:oMath>
+                    <m:r>
+                      <m:t>30</m:t>
                     </m:r>
                   </m:oMath>
                 </w:p>
@@ -18206,7 +18211,7 @@
               </w:tc>
               <w:tc>
                 <w:tcPr>
-                  <w:tcW w:w="965" w:type="dxa"/>
+                  <w:tcW w:w="1915" w:type="dxa"/>
                 </w:tcPr>
                 <w:p>
                   <w:pPr>
@@ -18216,11 +18221,13 @@
                   </w:pPr>
                   <m:oMath>
                     <m:r>
-                      <m:t>30</m:t>
+                      <m:t>F</m:t>
                     </m:r>
                   </m:oMath>
                 </w:p>
               </w:tc>
+            </w:tr>
+            <w:tr>
               <w:tc>
                 <w:tcPr>
                   <w:tcW w:w="1915" w:type="dxa"/>
@@ -18233,13 +18240,45 @@
                   </w:pPr>
                   <m:oMath>
                     <m:r>
-                      <m:t>120</m:t>
+                      <m:t>80</m:t>
                     </m:r>
                   </m:oMath>
                 </w:p>
               </w:tc>
-            </w:tr>
-            <w:tr>
+              <w:tc>
+                <w:tcPr>
+                  <w:tcW w:w="965" w:type="dxa"/>
+                </w:tcPr>
+                <w:p>
+                  <w:pPr>
+                    <w:pStyle w:val="Compact"/>
+                    <w:bidi/>
+                    <w:jc w:val="center"/>
+                  </w:pPr>
+                  <m:oMath>
+                    <m:r>
+                      <m:t>30</m:t>
+                    </m:r>
+                  </m:oMath>
+                </w:p>
+              </w:tc>
+              <w:tc>
+                <w:tcPr>
+                  <w:tcW w:w="1155" w:type="dxa"/>
+                </w:tcPr>
+                <w:p>
+                  <w:pPr>
+                    <w:pStyle w:val="Compact"/>
+                    <w:bidi/>
+                    <w:jc w:val="center"/>
+                  </w:pPr>
+                  <m:oMath>
+                    <m:r>
+                      <m:t>50</m:t>
+                    </m:r>
+                  </m:oMath>
+                </w:p>
+              </w:tc>
               <w:tc>
                 <w:tcPr>
                   <w:tcW w:w="1915" w:type="dxa"/>
@@ -18264,9 +18303,11 @@
                   </m:oMath>
                 </w:p>
               </w:tc>
+            </w:tr>
+            <w:tr>
               <w:tc>
                 <w:tcPr>
-                  <w:tcW w:w="1155" w:type="dxa"/>
+                  <w:tcW w:w="1915" w:type="dxa"/>
                 </w:tcPr>
                 <w:p>
                   <w:pPr>
@@ -18276,7 +18317,7 @@
                   </w:pPr>
                   <m:oMath>
                     <m:r>
-                      <m:t>50</m:t>
+                      <m:t>200</m:t>
                     </m:r>
                   </m:oMath>
                 </w:p>
@@ -18293,14 +18334,14 @@
                   </w:pPr>
                   <m:oMath>
                     <m:r>
-                      <m:t>30</m:t>
+                      <m:t>60</m:t>
                     </m:r>
                   </m:oMath>
                 </w:p>
               </w:tc>
               <w:tc>
                 <w:tcPr>
-                  <w:tcW w:w="1915" w:type="dxa"/>
+                  <w:tcW w:w="1155" w:type="dxa"/>
                 </w:tcPr>
                 <w:p>
                   <w:pPr>
@@ -18310,13 +18351,11 @@
                   </w:pPr>
                   <m:oMath>
                     <m:r>
-                      <m:t>80</m:t>
+                      <m:t>140</m:t>
                     </m:r>
                   </m:oMath>
                 </w:p>
               </w:tc>
-            </w:tr>
-            <w:tr>
               <w:tc>
                 <w:tcPr>
                   <w:tcW w:w="1915" w:type="dxa"/>
@@ -18333,57 +18372,6 @@
                     </w:rPr>
                     <w:t xml:space="preserve">المجموع</w:t>
                   </w:r>
-                </w:p>
-              </w:tc>
-              <w:tc>
-                <w:tcPr>
-                  <w:tcW w:w="1155" w:type="dxa"/>
-                </w:tcPr>
-                <w:p>
-                  <w:pPr>
-                    <w:pStyle w:val="Compact"/>
-                    <w:bidi/>
-                    <w:jc w:val="center"/>
-                  </w:pPr>
-                  <m:oMath>
-                    <m:r>
-                      <m:t>140</m:t>
-                    </m:r>
-                  </m:oMath>
-                </w:p>
-              </w:tc>
-              <w:tc>
-                <w:tcPr>
-                  <w:tcW w:w="965" w:type="dxa"/>
-                </w:tcPr>
-                <w:p>
-                  <w:pPr>
-                    <w:pStyle w:val="Compact"/>
-                    <w:bidi/>
-                    <w:jc w:val="center"/>
-                  </w:pPr>
-                  <m:oMath>
-                    <m:r>
-                      <m:t>60</m:t>
-                    </m:r>
-                  </m:oMath>
-                </w:p>
-              </w:tc>
-              <w:tc>
-                <w:tcPr>
-                  <w:tcW w:w="1915" w:type="dxa"/>
-                </w:tcPr>
-                <w:p>
-                  <w:pPr>
-                    <w:pStyle w:val="Compact"/>
-                    <w:bidi/>
-                    <w:jc w:val="center"/>
-                  </w:pPr>
-                  <m:oMath>
-                    <m:r>
-                      <m:t>200</m:t>
-                    </m:r>
-                  </m:oMath>
                 </w:p>
               </w:tc>
             </w:tr>

</xml_diff>